<commit_message>
Patch code up to 7bb9aa44
Signed-off-by: Github Actions <actions@github.com>
</commit_message>
<xml_diff>
--- a/src/tests/e2e/files/dataset_pl/test_docx_table_single_cell.docx
+++ b/src/tests/e2e/files/dataset_pl/test_docx_table_single_cell.docx
@@ -4,7 +4,7 @@
   <w:body>
     <w:tbl>
       <w:tblPr>
-        <w:tblStyle w:val="TableGrid"/>
+        <w:tblStyle w:val="Tabela-Siatka"/>
         <w:tblW w:w="0" w:type="auto"/>
         <w:tblLook w:val="04A0" w:firstRow="1" w:lastRow="0" w:firstColumn="1" w:lastColumn="0" w:noHBand="0" w:noVBand="1"/>
       </w:tblPr>
@@ -17,22 +17,46 @@
             <w:tcW w:w="9350" w:type="dxa"/>
           </w:tcPr>
           <w:p>
-            <w:r>
-              <w:t>W cichej wiosce, położonej między fioletowymi wzgórzami i lśniącymi jeziorami, kiedyś mieszkał zegarmistrz, którego dzieła tykały nie tylko z czasem, ale i z pamięcią. Tworzył zegarki, które pamiętały śmiech, smutek i sny, wszystko związane w trybikach i szkle. Jego dłonie poruszały się z delikatną pewnością, jakby zszywał kilka minut w znaczenie.</w:t>
-            </w:r>
-          </w:p>
-          <w:p>
-            <w:r>
-              <w:t>Nikt nigdy nie wiedział, skąd pochodzi. Pewnego wiosennego poranka po prostu był, stojąc przy starej kamiennej studni ze złotym zegarkiem, który szeptał czyjąś zapomnianą kołysankę.</w:t>
-            </w:r>
-          </w:p>
-          <w:p>
-            <w:r>
-              <w:t>Mówił niewiele, ale gdy już mówił, ludzie słuchali. Mówili, że jego głos niósł ciszę nocnych lasów. Dzieci zostawiały na jego progu połamane zabawki, które zawsze pojawiały się tańczące lub nucące o wschodzie słońca.</w:t>
+            <w:pPr>
+              <w:spacing w:after="160" w:line="259" w:lineRule="auto"/>
+              <w:rPr>
+                <w:lang w:val="pl-PL"/>
+              </w:rPr>
+            </w:pPr>
+            <w:r>
+              <w:rPr>
+                <w:lang w:val="pl-PL"/>
+              </w:rPr>
+              <w:t>W cichej wiosce, położonej między fioletowymi wzgórzami i lśniącymi jeziorami, mieszkał niegdyś zegarmistrz, którego dzieła tykały nie tylko w rytm czasu, lecz także pamięci. Tworzył zegarki, które potrafiły zatrzymywać śmiech, smutek i sny</w:t>
+            </w:r>
+            <w:r>
+              <w:rPr>
+                <w:lang w:val="pl-PL"/>
+              </w:rPr>
+              <w:t>,</w:t>
+            </w:r>
+            <w:r>
+              <w:rPr>
+                <w:lang w:val="pl-PL"/>
+              </w:rPr>
+              <w:t xml:space="preserve"> wszystko zamknięte w trybikach i szkle. </w:t>
+            </w:r>
+            <w:r>
+              <w:rPr>
+                <w:lang w:val="pl-PL"/>
+              </w:rPr>
+              <w:t>Jego dłonie poruszały się delikatnie, lecz pewnie, jakby zszywał chwile w znaczenie</w:t>
+            </w:r>
+            <w:r>
+              <w:rPr>
+                <w:lang w:val="pl-PL"/>
+              </w:rPr>
+              <w:t>.</w:t>
             </w:r>
           </w:p>
           <w:p>
             <w:pPr>
+              <w:spacing w:after="160" w:line="259" w:lineRule="auto"/>
               <w:rPr>
                 <w:lang w:val="pl-PL"/>
               </w:rPr>
@@ -41,23 +65,12 @@
               <w:rPr>
                 <w:lang w:val="pl-PL"/>
               </w:rPr>
-              <w:t xml:space="preserve">W przeddzień jego setnego zegara wieś zebrała się pod latarniami kołyszącymi się niczym gwiazdy. Uśmiechnął się delikatnie, przekręcił klucz ostatniego </w:t>
-            </w:r>
-            <w:r>
-              <w:rPr>
-                <w:lang w:val="pl-PL"/>
-              </w:rPr>
-              <w:t>dzieła</w:t>
-            </w:r>
-            <w:r>
-              <w:rPr>
-                <w:lang w:val="pl-PL"/>
-              </w:rPr>
-              <w:t xml:space="preserve"> i wyszeptał imię, którego nikt nie potrafił powtórzyć, jakby rozpłynęło się w chwili usłyszenia.</w:t>
+              <w:t>Nikt nigdy nie wiedział, skąd pochodził. Pewnego wiosennego poranka po prostu się pojawił, stojąc przy starej kamiennej studni ze złotym zegarkiem, który szeptał czyjąś zapomnianą kołysankę.</w:t>
             </w:r>
           </w:p>
           <w:p>
             <w:pPr>
+              <w:spacing w:after="160" w:line="259" w:lineRule="auto"/>
               <w:rPr>
                 <w:lang w:val="pl-PL"/>
               </w:rPr>
@@ -66,11 +79,18 @@
               <w:rPr>
                 <w:lang w:val="pl-PL"/>
               </w:rPr>
-              <w:t>Wiatr zatrzymał je na sekundę: Trenvahir.</w:t>
+              <w:t xml:space="preserve">Mówił niewiele, ale gdy już mówił, ludzie słuchali. </w:t>
+            </w:r>
+            <w:r>
+              <w:rPr>
+                <w:lang w:val="pl-PL"/>
+              </w:rPr>
+              <w:t>Mówiono, że jego głos niesie ciszę nocnych lasów. Dzieci zostawiały na jego progu połamane zabawki, które zawsze wracały jako tańczące lub nucące o wschodzie słońca.</w:t>
             </w:r>
           </w:p>
           <w:p>
             <w:pPr>
+              <w:spacing w:after="160" w:line="259" w:lineRule="auto"/>
               <w:rPr>
                 <w:lang w:val="pl-PL"/>
               </w:rPr>
@@ -79,10 +99,86 @@
               <w:rPr>
                 <w:lang w:val="pl-PL"/>
               </w:rPr>
-              <w:t>A potem zniknął, pozostawiając po sobie pojedynczą nutę: „Niektóre życia nie są przeżywane do przodu, lecz głęboko”.</w:t>
+              <w:t>W przeddzień ukończenia jego setnego zegara wieś zebrała się pod latarniami kołyszącymi się niczym gwiazdy. Uśmiechnął się delikatnie, przekręcił klucz ostatniego dzieła i wyszeptał imię, którego nikt nie potrafił powtórzyć</w:t>
+            </w:r>
+            <w:r>
+              <w:rPr>
+                <w:lang w:val="pl-PL"/>
+              </w:rPr>
+              <w:t>,</w:t>
+            </w:r>
+            <w:r>
+              <w:rPr>
+                <w:lang w:val="pl-PL"/>
+              </w:rPr>
+              <w:t xml:space="preserve"> jakby rozpłynęło się w chwili usłyszenia.</w:t>
             </w:r>
           </w:p>
           <w:p>
+            <w:pPr>
+              <w:spacing w:after="160" w:line="259" w:lineRule="auto"/>
+              <w:rPr>
+                <w:lang w:val="pl-PL"/>
+              </w:rPr>
+            </w:pPr>
+            <w:r>
+              <w:rPr>
+                <w:lang w:val="pl-PL"/>
+              </w:rPr>
+              <w:t xml:space="preserve">Wiatr zatrzymał się na sekundę: </w:t>
+            </w:r>
+            <w:proofErr w:type="spellStart"/>
+            <w:r>
+              <w:rPr>
+                <w:b/>
+                <w:bCs/>
+                <w:lang w:val="pl-PL"/>
+              </w:rPr>
+              <w:t>Trenvahir</w:t>
+            </w:r>
+            <w:proofErr w:type="spellEnd"/>
+            <w:r>
+              <w:rPr>
+                <w:b/>
+                <w:bCs/>
+                <w:lang w:val="pl-PL"/>
+              </w:rPr>
+              <w:t>.</w:t>
+            </w:r>
+          </w:p>
+          <w:p>
+            <w:pPr>
+              <w:spacing w:after="160" w:line="259" w:lineRule="auto"/>
+              <w:rPr>
+                <w:lang w:val="pl-PL"/>
+              </w:rPr>
+            </w:pPr>
+            <w:r>
+              <w:rPr>
+                <w:lang w:val="pl-PL"/>
+              </w:rPr>
+              <w:t>A potem zniknął, pozostawiając po sobie jedną nutę: „</w:t>
+            </w:r>
+            <w:r>
+              <w:rPr>
+                <w:lang w:val="pl-PL"/>
+              </w:rPr>
+              <w:t>Niektóre życia nie biegną naprzód, lecz sięgają głębi</w:t>
+            </w:r>
+            <w:r>
+              <w:rPr>
+                <w:lang w:val="pl-PL"/>
+              </w:rPr>
+              <w:t>”.</w:t>
+            </w:r>
+          </w:p>
+          <w:p>
+            <w:pPr>
+              <w:spacing w:after="160" w:line="259" w:lineRule="auto"/>
+              <w:rPr>
+                <w:lang w:val="pl-PL"/>
+              </w:rPr>
+            </w:pPr>
             <w:r>
               <w:rPr>
                 <w:lang w:val="pl-PL"/>
@@ -90,11 +186,16 @@
               <w:t>Do dziś każdy zegar w wiosce wybija godzinę z westchnieniem.</w:t>
             </w:r>
           </w:p>
-          <w:p/>
         </w:tc>
       </w:tr>
     </w:tbl>
-    <w:p/>
+    <w:p>
+      <w:pPr>
+        <w:rPr>
+          <w:lang w:val="pl-PL"/>
+        </w:rPr>
+      </w:pPr>
+    </w:p>
     <w:sectPr>
       <w:pgSz w:w="12240" w:h="15840"/>
       <w:pgMar w:top="1440" w:right="1440" w:bottom="1440" w:left="1440" w:header="720" w:footer="720" w:gutter="0"/>
@@ -502,15 +603,15 @@
     <w:lsdException w:name="Unresolved Mention" w:semiHidden="1" w:unhideWhenUsed="1"/>
     <w:lsdException w:name="Smart Link" w:semiHidden="1" w:unhideWhenUsed="1"/>
   </w:latentStyles>
-  <w:style w:type="paragraph" w:default="1" w:styleId="Normal">
+  <w:style w:type="paragraph" w:default="1" w:styleId="Normalny">
     <w:name w:val="Normal"/>
     <w:qFormat/>
   </w:style>
-  <w:style w:type="paragraph" w:styleId="Heading1">
+  <w:style w:type="paragraph" w:styleId="Nagwek1">
     <w:name w:val="heading 1"/>
-    <w:basedOn w:val="Normal"/>
-    <w:next w:val="Normal"/>
-    <w:link w:val="Heading1Char"/>
+    <w:basedOn w:val="Normalny"/>
+    <w:next w:val="Normalny"/>
+    <w:link w:val="Nagwek1Znak"/>
     <w:uiPriority w:val="9"/>
     <w:qFormat/>
     <w:rsid w:val="009C30B5"/>
@@ -527,11 +628,11 @@
       <w:szCs w:val="40"/>
     </w:rPr>
   </w:style>
-  <w:style w:type="paragraph" w:styleId="Heading2">
+  <w:style w:type="paragraph" w:styleId="Nagwek2">
     <w:name w:val="heading 2"/>
-    <w:basedOn w:val="Normal"/>
-    <w:next w:val="Normal"/>
-    <w:link w:val="Heading2Char"/>
+    <w:basedOn w:val="Normalny"/>
+    <w:next w:val="Normalny"/>
+    <w:link w:val="Nagwek2Znak"/>
     <w:uiPriority w:val="9"/>
     <w:semiHidden/>
     <w:unhideWhenUsed/>
@@ -550,11 +651,11 @@
       <w:szCs w:val="32"/>
     </w:rPr>
   </w:style>
-  <w:style w:type="paragraph" w:styleId="Heading3">
+  <w:style w:type="paragraph" w:styleId="Nagwek3">
     <w:name w:val="heading 3"/>
-    <w:basedOn w:val="Normal"/>
-    <w:next w:val="Normal"/>
-    <w:link w:val="Heading3Char"/>
+    <w:basedOn w:val="Normalny"/>
+    <w:next w:val="Normalny"/>
+    <w:link w:val="Nagwek3Znak"/>
     <w:uiPriority w:val="9"/>
     <w:semiHidden/>
     <w:unhideWhenUsed/>
@@ -573,11 +674,11 @@
       <w:szCs w:val="28"/>
     </w:rPr>
   </w:style>
-  <w:style w:type="paragraph" w:styleId="Heading4">
+  <w:style w:type="paragraph" w:styleId="Nagwek4">
     <w:name w:val="heading 4"/>
-    <w:basedOn w:val="Normal"/>
-    <w:next w:val="Normal"/>
-    <w:link w:val="Heading4Char"/>
+    <w:basedOn w:val="Normalny"/>
+    <w:next w:val="Normalny"/>
+    <w:link w:val="Nagwek4Znak"/>
     <w:uiPriority w:val="9"/>
     <w:semiHidden/>
     <w:unhideWhenUsed/>
@@ -596,11 +697,11 @@
       <w:color w:val="0F4761" w:themeColor="accent1" w:themeShade="BF"/>
     </w:rPr>
   </w:style>
-  <w:style w:type="paragraph" w:styleId="Heading5">
+  <w:style w:type="paragraph" w:styleId="Nagwek5">
     <w:name w:val="heading 5"/>
-    <w:basedOn w:val="Normal"/>
-    <w:next w:val="Normal"/>
-    <w:link w:val="Heading5Char"/>
+    <w:basedOn w:val="Normalny"/>
+    <w:next w:val="Normalny"/>
+    <w:link w:val="Nagwek5Znak"/>
     <w:uiPriority w:val="9"/>
     <w:semiHidden/>
     <w:unhideWhenUsed/>
@@ -617,11 +718,11 @@
       <w:color w:val="0F4761" w:themeColor="accent1" w:themeShade="BF"/>
     </w:rPr>
   </w:style>
-  <w:style w:type="paragraph" w:styleId="Heading6">
+  <w:style w:type="paragraph" w:styleId="Nagwek6">
     <w:name w:val="heading 6"/>
-    <w:basedOn w:val="Normal"/>
-    <w:next w:val="Normal"/>
-    <w:link w:val="Heading6Char"/>
+    <w:basedOn w:val="Normalny"/>
+    <w:next w:val="Normalny"/>
+    <w:link w:val="Nagwek6Znak"/>
     <w:uiPriority w:val="9"/>
     <w:semiHidden/>
     <w:unhideWhenUsed/>
@@ -640,11 +741,11 @@
       <w:color w:val="595959" w:themeColor="text1" w:themeTint="A6"/>
     </w:rPr>
   </w:style>
-  <w:style w:type="paragraph" w:styleId="Heading7">
+  <w:style w:type="paragraph" w:styleId="Nagwek7">
     <w:name w:val="heading 7"/>
-    <w:basedOn w:val="Normal"/>
-    <w:next w:val="Normal"/>
-    <w:link w:val="Heading7Char"/>
+    <w:basedOn w:val="Normalny"/>
+    <w:next w:val="Normalny"/>
+    <w:link w:val="Nagwek7Znak"/>
     <w:uiPriority w:val="9"/>
     <w:semiHidden/>
     <w:unhideWhenUsed/>
@@ -661,11 +762,11 @@
       <w:color w:val="595959" w:themeColor="text1" w:themeTint="A6"/>
     </w:rPr>
   </w:style>
-  <w:style w:type="paragraph" w:styleId="Heading8">
+  <w:style w:type="paragraph" w:styleId="Nagwek8">
     <w:name w:val="heading 8"/>
-    <w:basedOn w:val="Normal"/>
-    <w:next w:val="Normal"/>
-    <w:link w:val="Heading8Char"/>
+    <w:basedOn w:val="Normalny"/>
+    <w:next w:val="Normalny"/>
+    <w:link w:val="Nagwek8Znak"/>
     <w:uiPriority w:val="9"/>
     <w:semiHidden/>
     <w:unhideWhenUsed/>
@@ -684,11 +785,11 @@
       <w:color w:val="272727" w:themeColor="text1" w:themeTint="D8"/>
     </w:rPr>
   </w:style>
-  <w:style w:type="paragraph" w:styleId="Heading9">
+  <w:style w:type="paragraph" w:styleId="Nagwek9">
     <w:name w:val="heading 9"/>
-    <w:basedOn w:val="Normal"/>
-    <w:next w:val="Normal"/>
-    <w:link w:val="Heading9Char"/>
+    <w:basedOn w:val="Normalny"/>
+    <w:next w:val="Normalny"/>
+    <w:link w:val="Nagwek9Znak"/>
     <w:uiPriority w:val="9"/>
     <w:semiHidden/>
     <w:unhideWhenUsed/>
@@ -705,12 +806,13 @@
       <w:color w:val="272727" w:themeColor="text1" w:themeTint="D8"/>
     </w:rPr>
   </w:style>
-  <w:style w:type="character" w:default="1" w:styleId="DefaultParagraphFont">
+  <w:style w:type="character" w:default="1" w:styleId="Domylnaczcionkaakapitu">
     <w:name w:val="Default Paragraph Font"/>
     <w:uiPriority w:val="1"/>
+    <w:semiHidden/>
     <w:unhideWhenUsed/>
   </w:style>
-  <w:style w:type="table" w:default="1" w:styleId="TableNormal">
+  <w:style w:type="table" w:default="1" w:styleId="Standardowy">
     <w:name w:val="Normal Table"/>
     <w:uiPriority w:val="99"/>
     <w:semiHidden/>
@@ -725,16 +827,16 @@
       </w:tblCellMar>
     </w:tblPr>
   </w:style>
-  <w:style w:type="numbering" w:default="1" w:styleId="NoList">
+  <w:style w:type="numbering" w:default="1" w:styleId="Bezlisty">
     <w:name w:val="No List"/>
     <w:uiPriority w:val="99"/>
     <w:semiHidden/>
     <w:unhideWhenUsed/>
   </w:style>
-  <w:style w:type="character" w:customStyle="1" w:styleId="Heading1Char">
-    <w:name w:val="Heading 1 Char"/>
-    <w:basedOn w:val="DefaultParagraphFont"/>
-    <w:link w:val="Heading1"/>
+  <w:style w:type="character" w:customStyle="1" w:styleId="Nagwek1Znak">
+    <w:name w:val="Nagłówek 1 Znak"/>
+    <w:basedOn w:val="Domylnaczcionkaakapitu"/>
+    <w:link w:val="Nagwek1"/>
     <w:uiPriority w:val="9"/>
     <w:rsid w:val="009C30B5"/>
     <w:rPr>
@@ -744,10 +846,10 @@
       <w:szCs w:val="40"/>
     </w:rPr>
   </w:style>
-  <w:style w:type="character" w:customStyle="1" w:styleId="Heading2Char">
-    <w:name w:val="Heading 2 Char"/>
-    <w:basedOn w:val="DefaultParagraphFont"/>
-    <w:link w:val="Heading2"/>
+  <w:style w:type="character" w:customStyle="1" w:styleId="Nagwek2Znak">
+    <w:name w:val="Nagłówek 2 Znak"/>
+    <w:basedOn w:val="Domylnaczcionkaakapitu"/>
+    <w:link w:val="Nagwek2"/>
     <w:uiPriority w:val="9"/>
     <w:semiHidden/>
     <w:rsid w:val="009C30B5"/>
@@ -758,10 +860,10 @@
       <w:szCs w:val="32"/>
     </w:rPr>
   </w:style>
-  <w:style w:type="character" w:customStyle="1" w:styleId="Heading3Char">
-    <w:name w:val="Heading 3 Char"/>
-    <w:basedOn w:val="DefaultParagraphFont"/>
-    <w:link w:val="Heading3"/>
+  <w:style w:type="character" w:customStyle="1" w:styleId="Nagwek3Znak">
+    <w:name w:val="Nagłówek 3 Znak"/>
+    <w:basedOn w:val="Domylnaczcionkaakapitu"/>
+    <w:link w:val="Nagwek3"/>
     <w:uiPriority w:val="9"/>
     <w:semiHidden/>
     <w:rsid w:val="009C30B5"/>
@@ -772,10 +874,10 @@
       <w:szCs w:val="28"/>
     </w:rPr>
   </w:style>
-  <w:style w:type="character" w:customStyle="1" w:styleId="Heading4Char">
-    <w:name w:val="Heading 4 Char"/>
-    <w:basedOn w:val="DefaultParagraphFont"/>
-    <w:link w:val="Heading4"/>
+  <w:style w:type="character" w:customStyle="1" w:styleId="Nagwek4Znak">
+    <w:name w:val="Nagłówek 4 Znak"/>
+    <w:basedOn w:val="Domylnaczcionkaakapitu"/>
+    <w:link w:val="Nagwek4"/>
     <w:uiPriority w:val="9"/>
     <w:semiHidden/>
     <w:rsid w:val="009C30B5"/>
@@ -786,10 +888,10 @@
       <w:color w:val="0F4761" w:themeColor="accent1" w:themeShade="BF"/>
     </w:rPr>
   </w:style>
-  <w:style w:type="character" w:customStyle="1" w:styleId="Heading5Char">
-    <w:name w:val="Heading 5 Char"/>
-    <w:basedOn w:val="DefaultParagraphFont"/>
-    <w:link w:val="Heading5"/>
+  <w:style w:type="character" w:customStyle="1" w:styleId="Nagwek5Znak">
+    <w:name w:val="Nagłówek 5 Znak"/>
+    <w:basedOn w:val="Domylnaczcionkaakapitu"/>
+    <w:link w:val="Nagwek5"/>
     <w:uiPriority w:val="9"/>
     <w:semiHidden/>
     <w:rsid w:val="009C30B5"/>
@@ -798,10 +900,10 @@
       <w:color w:val="0F4761" w:themeColor="accent1" w:themeShade="BF"/>
     </w:rPr>
   </w:style>
-  <w:style w:type="character" w:customStyle="1" w:styleId="Heading6Char">
-    <w:name w:val="Heading 6 Char"/>
-    <w:basedOn w:val="DefaultParagraphFont"/>
-    <w:link w:val="Heading6"/>
+  <w:style w:type="character" w:customStyle="1" w:styleId="Nagwek6Znak">
+    <w:name w:val="Nagłówek 6 Znak"/>
+    <w:basedOn w:val="Domylnaczcionkaakapitu"/>
+    <w:link w:val="Nagwek6"/>
     <w:uiPriority w:val="9"/>
     <w:semiHidden/>
     <w:rsid w:val="009C30B5"/>
@@ -812,10 +914,10 @@
       <w:color w:val="595959" w:themeColor="text1" w:themeTint="A6"/>
     </w:rPr>
   </w:style>
-  <w:style w:type="character" w:customStyle="1" w:styleId="Heading7Char">
-    <w:name w:val="Heading 7 Char"/>
-    <w:basedOn w:val="DefaultParagraphFont"/>
-    <w:link w:val="Heading7"/>
+  <w:style w:type="character" w:customStyle="1" w:styleId="Nagwek7Znak">
+    <w:name w:val="Nagłówek 7 Znak"/>
+    <w:basedOn w:val="Domylnaczcionkaakapitu"/>
+    <w:link w:val="Nagwek7"/>
     <w:uiPriority w:val="9"/>
     <w:semiHidden/>
     <w:rsid w:val="009C30B5"/>
@@ -824,10 +926,10 @@
       <w:color w:val="595959" w:themeColor="text1" w:themeTint="A6"/>
     </w:rPr>
   </w:style>
-  <w:style w:type="character" w:customStyle="1" w:styleId="Heading8Char">
-    <w:name w:val="Heading 8 Char"/>
-    <w:basedOn w:val="DefaultParagraphFont"/>
-    <w:link w:val="Heading8"/>
+  <w:style w:type="character" w:customStyle="1" w:styleId="Nagwek8Znak">
+    <w:name w:val="Nagłówek 8 Znak"/>
+    <w:basedOn w:val="Domylnaczcionkaakapitu"/>
+    <w:link w:val="Nagwek8"/>
     <w:uiPriority w:val="9"/>
     <w:semiHidden/>
     <w:rsid w:val="009C30B5"/>
@@ -838,10 +940,10 @@
       <w:color w:val="272727" w:themeColor="text1" w:themeTint="D8"/>
     </w:rPr>
   </w:style>
-  <w:style w:type="character" w:customStyle="1" w:styleId="Heading9Char">
-    <w:name w:val="Heading 9 Char"/>
-    <w:basedOn w:val="DefaultParagraphFont"/>
-    <w:link w:val="Heading9"/>
+  <w:style w:type="character" w:customStyle="1" w:styleId="Nagwek9Znak">
+    <w:name w:val="Nagłówek 9 Znak"/>
+    <w:basedOn w:val="Domylnaczcionkaakapitu"/>
+    <w:link w:val="Nagwek9"/>
     <w:uiPriority w:val="9"/>
     <w:semiHidden/>
     <w:rsid w:val="009C30B5"/>
@@ -850,11 +952,11 @@
       <w:color w:val="272727" w:themeColor="text1" w:themeTint="D8"/>
     </w:rPr>
   </w:style>
-  <w:style w:type="paragraph" w:styleId="Title">
+  <w:style w:type="paragraph" w:styleId="Tytu">
     <w:name w:val="Title"/>
-    <w:basedOn w:val="Normal"/>
-    <w:next w:val="Normal"/>
-    <w:link w:val="TitleChar"/>
+    <w:basedOn w:val="Normalny"/>
+    <w:next w:val="Normalny"/>
+    <w:link w:val="TytuZnak"/>
     <w:uiPriority w:val="10"/>
     <w:qFormat/>
     <w:rsid w:val="009C30B5"/>
@@ -870,10 +972,10 @@
       <w:szCs w:val="56"/>
     </w:rPr>
   </w:style>
-  <w:style w:type="character" w:customStyle="1" w:styleId="TitleChar">
-    <w:name w:val="Title Char"/>
-    <w:basedOn w:val="DefaultParagraphFont"/>
-    <w:link w:val="Title"/>
+  <w:style w:type="character" w:customStyle="1" w:styleId="TytuZnak">
+    <w:name w:val="Tytuł Znak"/>
+    <w:basedOn w:val="Domylnaczcionkaakapitu"/>
+    <w:link w:val="Tytu"/>
     <w:uiPriority w:val="10"/>
     <w:rsid w:val="009C30B5"/>
     <w:rPr>
@@ -884,11 +986,11 @@
       <w:szCs w:val="56"/>
     </w:rPr>
   </w:style>
-  <w:style w:type="paragraph" w:styleId="Subtitle">
+  <w:style w:type="paragraph" w:styleId="Podtytu">
     <w:name w:val="Subtitle"/>
-    <w:basedOn w:val="Normal"/>
-    <w:next w:val="Normal"/>
-    <w:link w:val="SubtitleChar"/>
+    <w:basedOn w:val="Normalny"/>
+    <w:next w:val="Normalny"/>
+    <w:link w:val="PodtytuZnak"/>
     <w:uiPriority w:val="11"/>
     <w:qFormat/>
     <w:rsid w:val="009C30B5"/>
@@ -905,10 +1007,10 @@
       <w:szCs w:val="28"/>
     </w:rPr>
   </w:style>
-  <w:style w:type="character" w:customStyle="1" w:styleId="SubtitleChar">
-    <w:name w:val="Subtitle Char"/>
-    <w:basedOn w:val="DefaultParagraphFont"/>
-    <w:link w:val="Subtitle"/>
+  <w:style w:type="character" w:customStyle="1" w:styleId="PodtytuZnak">
+    <w:name w:val="Podtytuł Znak"/>
+    <w:basedOn w:val="Domylnaczcionkaakapitu"/>
+    <w:link w:val="Podtytu"/>
     <w:uiPriority w:val="11"/>
     <w:rsid w:val="009C30B5"/>
     <w:rPr>
@@ -919,11 +1021,11 @@
       <w:szCs w:val="28"/>
     </w:rPr>
   </w:style>
-  <w:style w:type="paragraph" w:styleId="Quote">
+  <w:style w:type="paragraph" w:styleId="Cytat">
     <w:name w:val="Quote"/>
-    <w:basedOn w:val="Normal"/>
-    <w:next w:val="Normal"/>
-    <w:link w:val="QuoteChar"/>
+    <w:basedOn w:val="Normalny"/>
+    <w:next w:val="Normalny"/>
+    <w:link w:val="CytatZnak"/>
     <w:uiPriority w:val="29"/>
     <w:qFormat/>
     <w:rsid w:val="009C30B5"/>
@@ -937,10 +1039,10 @@
       <w:color w:val="404040" w:themeColor="text1" w:themeTint="BF"/>
     </w:rPr>
   </w:style>
-  <w:style w:type="character" w:customStyle="1" w:styleId="QuoteChar">
-    <w:name w:val="Quote Char"/>
-    <w:basedOn w:val="DefaultParagraphFont"/>
-    <w:link w:val="Quote"/>
+  <w:style w:type="character" w:customStyle="1" w:styleId="CytatZnak">
+    <w:name w:val="Cytat Znak"/>
+    <w:basedOn w:val="Domylnaczcionkaakapitu"/>
+    <w:link w:val="Cytat"/>
     <w:uiPriority w:val="29"/>
     <w:rsid w:val="009C30B5"/>
     <w:rPr>
@@ -949,9 +1051,9 @@
       <w:color w:val="404040" w:themeColor="text1" w:themeTint="BF"/>
     </w:rPr>
   </w:style>
-  <w:style w:type="paragraph" w:styleId="ListParagraph">
+  <w:style w:type="paragraph" w:styleId="Akapitzlist">
     <w:name w:val="List Paragraph"/>
-    <w:basedOn w:val="Normal"/>
+    <w:basedOn w:val="Normalny"/>
     <w:uiPriority w:val="34"/>
     <w:qFormat/>
     <w:rsid w:val="009C30B5"/>
@@ -960,9 +1062,9 @@
       <w:contextualSpacing/>
     </w:pPr>
   </w:style>
-  <w:style w:type="character" w:styleId="IntenseEmphasis">
+  <w:style w:type="character" w:styleId="Wyrnienieintensywne">
     <w:name w:val="Intense Emphasis"/>
-    <w:basedOn w:val="DefaultParagraphFont"/>
+    <w:basedOn w:val="Domylnaczcionkaakapitu"/>
     <w:uiPriority w:val="21"/>
     <w:qFormat/>
     <w:rsid w:val="009C30B5"/>
@@ -972,11 +1074,11 @@
       <w:color w:val="0F4761" w:themeColor="accent1" w:themeShade="BF"/>
     </w:rPr>
   </w:style>
-  <w:style w:type="paragraph" w:styleId="IntenseQuote">
+  <w:style w:type="paragraph" w:styleId="Cytatintensywny">
     <w:name w:val="Intense Quote"/>
-    <w:basedOn w:val="Normal"/>
-    <w:next w:val="Normal"/>
-    <w:link w:val="IntenseQuoteChar"/>
+    <w:basedOn w:val="Normalny"/>
+    <w:next w:val="Normalny"/>
+    <w:link w:val="CytatintensywnyZnak"/>
     <w:uiPriority w:val="30"/>
     <w:qFormat/>
     <w:rsid w:val="009C30B5"/>
@@ -995,10 +1097,10 @@
       <w:color w:val="0F4761" w:themeColor="accent1" w:themeShade="BF"/>
     </w:rPr>
   </w:style>
-  <w:style w:type="character" w:customStyle="1" w:styleId="IntenseQuoteChar">
-    <w:name w:val="Intense Quote Char"/>
-    <w:basedOn w:val="DefaultParagraphFont"/>
-    <w:link w:val="IntenseQuote"/>
+  <w:style w:type="character" w:customStyle="1" w:styleId="CytatintensywnyZnak">
+    <w:name w:val="Cytat intensywny Znak"/>
+    <w:basedOn w:val="Domylnaczcionkaakapitu"/>
+    <w:link w:val="Cytatintensywny"/>
     <w:uiPriority w:val="30"/>
     <w:rsid w:val="009C30B5"/>
     <w:rPr>
@@ -1007,9 +1109,9 @@
       <w:color w:val="0F4761" w:themeColor="accent1" w:themeShade="BF"/>
     </w:rPr>
   </w:style>
-  <w:style w:type="character" w:styleId="IntenseReference">
+  <w:style w:type="character" w:styleId="Odwoanieintensywne">
     <w:name w:val="Intense Reference"/>
-    <w:basedOn w:val="DefaultParagraphFont"/>
+    <w:basedOn w:val="Domylnaczcionkaakapitu"/>
     <w:uiPriority w:val="32"/>
     <w:qFormat/>
     <w:rsid w:val="009C30B5"/>
@@ -1021,9 +1123,9 @@
       <w:spacing w:val="5"/>
     </w:rPr>
   </w:style>
-  <w:style w:type="table" w:styleId="TableGrid">
+  <w:style w:type="table" w:styleId="Tabela-Siatka">
     <w:name w:val="Table Grid"/>
-    <w:basedOn w:val="TableNormal"/>
+    <w:basedOn w:val="Standardowy"/>
     <w:uiPriority w:val="39"/>
     <w:rsid w:val="009C30B5"/>
     <w:pPr>
@@ -1040,9 +1142,9 @@
       </w:tblBorders>
     </w:tblPr>
   </w:style>
-  <w:style w:type="character" w:styleId="PlaceholderText">
+  <w:style w:type="character" w:styleId="Tekstzastpczy">
     <w:name w:val="Placeholder Text"/>
-    <w:basedOn w:val="DefaultParagraphFont"/>
+    <w:basedOn w:val="Domylnaczcionkaakapitu"/>
     <w:uiPriority w:val="99"/>
     <w:semiHidden/>
     <w:rsid w:val="00B2382D"/>

</xml_diff>